<commit_message>
Polish v5 evidence figures and manuscript logic
</commit_message>
<xml_diff>
--- a/manuscript/Plant_CellFM_v5_Manuscript_en.docx
+++ b/manuscript/Plant_CellFM_v5_Manuscript_en.docx
@@ -82,7 +82,7 @@
           <w:sz w:val="20"/>
           <w:szCs w:val="20"/>
         </w:rPr>
-        <w:t xml:space="preserve">Plant single-cell and single-nucleus atlases are expanding across model plants, crops and non-model species, yet annotation transfer remains confounded by gene-identifier differences, open cell-state vocabularies and mixed evaluation protocols. We present Plant-CellFM, a plant expression modelling framework that treats annotation as an auditable evidence chain rather than a single classifier score. The frozen corpus profile contains 272,732 cells, 209,405 genes, five profiled species, nine public datasets, 31 samples and 34 raw labels; the separate strict evaluation panel contains 3,964 aligned cells from eight held-out species. Plant-CellFM combines a 256-dimensional four-layer encoder, an explicit gene-identifier and orthology contract, LoRA adaptation interfaces, hierarchical annotation outputs, ranked marker candidates and a runtime annotation head. In the primary nested leave-species protocol, target labels are excluded from fitting, rule selection and calibration. The result is 39.96% all-cell accuracy, 55.90% source-label coverage, 71.48% accuracy and 0.2817 macro-F1 on the covered-label subset. Labelled target-species adaptation gives a reproducible dose response from 59.21% to 75.89% mean query all-cell accuracy as support increases from 8 to 64 cells per species across ten disjoint support-query draws. We further provide a label-free external root execution audit, a marker-candidate resource, and an author-labelled secondary-root adaptation case. In GSE270140/GSM8335426, a LoRA-mode context adapter achieves 83.97% fine accuracy and 84.47% macro-F1 on 2,352 locked test cells, while a pre-registered three-state vascular mapping increases semantic accuracy from 2.02% for the frozen base checkpoint to 90.93% after adaptation. This latter result is explicitly a one-sample supervised adaptation, not a zero-shot or independent validation result. Plant-CellFM therefore provides a reproducible route for separating strict transfer, target-context adaptation and deployment annotation in plant atlas analysis.</w:t>
+        <w:t xml:space="preserve">Plant single-cell and single-nucleus atlases are expanding across model plants, crops and non-model species, yet annotation transfer remains confounded by gene-identifier differences, open cell-state vocabularies and mixed evaluation protocols. We present Plant-CellFM, a plant expression modelling framework that treats annotation as an auditable evidence chain rather than a single classifier score. The frozen corpus profile contains 272,732 cells, 209,405 genes, five profiled species, nine public datasets, 31 samples and 34 raw labels; the separate strict evaluation panel contains 3,964 aligned cells from eight held-out species. Plant-CellFM combines a 256-dimensional four-layer encoder, an explicit gene-identifier and orthology contract, LoRA adaptation interfaces, hierarchical annotation outputs, ranked marker candidates and a runtime annotation head. In the primary nested leave-species protocol, target labels are excluded from fitting, rule selection and calibration. The result is 39.96% all-cell accuracy, 55.90% source-label coverage, 71.48% accuracy and 0.2817 macro-F1 on the covered-label subset. A separate global context-sensitivity analysis, reported outside the primary protocol, reaches 42.36% all-cell accuracy with the same frozen panel and denominator; its rule-selection boundary remains explicit. Labelled target-species adaptation gives a reproducible dose response from 59.21% to 75.89% mean query all-cell accuracy as support increases from 8 to 64 cells per species across ten disjoint support-query draws. We further provide a label-free external root execution audit, a marker-candidate resource, and an author-labelled secondary-root adaptation case. In GSE270140/GSM8335426, a LoRA-mode context adapter achieves 83.97% fine accuracy and 84.47% macro-F1 on 2,352 locked test cells, while a pre-registered three-state vascular mapping increases semantic accuracy from 2.02% for the frozen base checkpoint to 90.93% after adaptation. This latter result is explicitly a one-sample supervised adaptation, not a zero-shot or independent validation result. Plant-CellFM therefore provides a reproducible route for separating strict transfer, target-context adaptation and deployment annotation in plant atlas analysis.</w:t>
       </w:r>
     </w:p>
     <w:p>
@@ -275,6 +275,21 @@
     </w:p>
     <w:p>
       <w:pPr>
+        <w:spacing w:after="125" w:line="278"/>
+        <w:jc w:val="both"/>
+      </w:pPr>
+      <w:r>
+        <w:rPr>
+          <w:rFonts w:ascii="Arial" w:cs="Arial" w:eastAsia="Arial" w:hAnsi="Arial"/>
+          <w:color w:val="18242E"/>
+          <w:sz w:val="20"/>
+          <w:szCs w:val="20"/>
+        </w:rPr>
+        <w:t xml:space="preserve">We separately examined whether context could reduce cross-species error on the frozen panel using a context-aware species-transfer calibration (phylo_organ_gate_v1). The gate uses organ and phylogenetic support estimated from source species: it retains expression-based transfer when informative same-family support is available, and otherwise falls back to an organ prior. On the same 3,964 cells, exact-label denominator and 55.90% source-label coverage, all-cell accuracy rises from 23.64% for the centroid baseline through 30.10% for expression STC and 31.84% for neural STC to 42.36% for the context-aware gate (Fig. 2e). Covered-label accuracy reaches 75.77% and covered-label macro-F1 is 0.3045. Because configuration selection aggregates outer-fold information, this is a global context-sensitivity analysis rather than a replacement for the nested v17 primary result. It is retained to identify an implementable context module and to make its selection boundary inspectable.</w:t>
+      </w:r>
+    </w:p>
+    <w:p>
+      <w:pPr>
         <w:pStyle w:val="Heading2"/>
         <w:spacing w:after="110" w:before="205"/>
       </w:pPr>
@@ -554,7 +569,7 @@
           <w:sz w:val="20"/>
           <w:szCs w:val="20"/>
         </w:rPr>
-        <w:t xml:space="preserve">The v17 protocol uses nested source-species selection. Each outer held-out species is evaluated once, after candidate rules are ranked only using source-species inner folds. All-cell accuracy uses every held-out cell as the denominator. Source-label coverage, known-label accuracy and known-label macro-F1 are calculated and reported separately. Few-shot adaptation samples labelled support cells by species, keeps support and query cells non-overlapping, and aggregates ten independent draws per support budget.</w:t>
+        <w:t xml:space="preserve">The v17 protocol uses nested source-species selection. Each outer held-out species is evaluated once, after candidate rules are ranked only using source-species inner folds. All-cell accuracy uses every held-out cell as the denominator. Source-label coverage, known-label accuracy and known-label macro-F1 are calculated and reported separately. The context-aware species-transfer calibration (phylo_organ_gate_v1) is a separate global sensitivity analysis over the frozen panel: it records the same denominator and uses organ and phylogenetic support, but its configuration is selected with aggregated outer-fold information and is therefore not promoted to a nested primary result. Few-shot adaptation samples labelled support cells by species, keeps support and query cells non-overlapping, and aggregates ten independent draws per support budget.</w:t>
       </w:r>
     </w:p>
     <w:p>
@@ -724,7 +739,7 @@
           <w:sz w:val="20"/>
           <w:szCs w:val="20"/>
         </w:rPr>
-        <w:t xml:space="preserve">Figure 2 | Nested strict transfer retains open-set cells. The reference and strict output views use the same held-out cells. The denominator panel exposes all test cells, source-label-covered cells and open-set or unavailable labels. Species-level all-cell accuracy, conditional accuracy and coverage are shown with a nested-selection firewall.</w:t>
+        <w:t xml:space="preserve">Figure 2 | Nested strict transfer retains open-set cells. The reference and strict output views use the same held-out cells. The denominator panel exposes all test cells, source-label-covered cells and open-set or unavailable labels. Species-level all-cell accuracy, conditional accuracy and coverage remain visible. The final panel compares centroid, expression, neural and context-aware transfer on the same 3,964 cells, exact-label denominator and 55.90% coverage. The last comparison is a global context-sensitivity analysis and does not replace the nested v17 primary result.</w:t>
       </w:r>
     </w:p>
     <w:p>

</xml_diff>

<commit_message>
release: add wheat adaptation and submission figure package
</commit_message>
<xml_diff>
--- a/manuscript/Plant_CellFM_v5_Manuscript_en.docx
+++ b/manuscript/Plant_CellFM_v5_Manuscript_en.docx
@@ -82,7 +82,7 @@
           <w:sz w:val="20"/>
           <w:szCs w:val="20"/>
         </w:rPr>
-        <w:t xml:space="preserve">Plant single-cell and single-nucleus atlases are expanding across model plants, crops and non-model species, yet annotation transfer remains confounded by gene-identifier differences, open cell-state vocabularies and mixed evaluation protocols. We present Plant-CellFM, a plant expression modelling framework that treats annotation as an auditable evidence chain rather than a single classifier score. The frozen corpus profile contains 272,732 cells, 209,405 genes, five profiled species, nine public datasets, 31 samples and 34 raw labels; the separate strict evaluation panel contains 3,964 aligned cells from eight held-out species. Plant-CellFM combines a 256-dimensional four-layer encoder, an explicit gene-identifier and orthology contract, LoRA adaptation interfaces, hierarchical annotation outputs, ranked marker candidates and a runtime annotation head. In the primary nested leave-species protocol, target labels are excluded from fitting, rule selection and calibration. The result is 39.96% all-cell accuracy, 55.90% source-label coverage, 71.48% accuracy and 0.2817 macro-F1 on the covered-label subset. A separate global context-sensitivity analysis, reported outside the primary protocol, reaches 42.36% all-cell accuracy with the same frozen panel and denominator; its rule-selection boundary remains explicit. Labelled target-species adaptation gives a reproducible dose response from 59.21% to 75.89% mean query all-cell accuracy as support increases from 8 to 64 cells per species across ten disjoint support-query draws. We further provide a label-free external root execution audit, a marker-candidate resource, and an author-labelled secondary-root adaptation case. In GSE270140/GSM8335426, a LoRA-mode context adapter achieves 83.97% fine accuracy and 84.47% macro-F1 on 2,352 locked test cells, while a pre-registered three-state vascular mapping increases semantic accuracy from 2.02% for the frozen base checkpoint to 90.93% after adaptation. This latter result is explicitly a one-sample supervised adaptation, not a zero-shot or independent validation result. Plant-CellFM therefore provides a reproducible route for separating strict transfer, target-context adaptation and deployment annotation in plant atlas analysis.</w:t>
+        <w:t xml:space="preserve">Plant single-cell and single-nucleus atlases are expanding across model plants, crops and non-model species, yet annotation transfer remains confounded by gene-identifier differences, open cell-state vocabularies and mixed evaluation protocols. We present Plant-CellFM, a plant expression modelling framework that treats annotation as an auditable evidence chain rather than a single classifier score. The frozen corpus profile contains 272,732 cells, 209,405 genes, five profiled species, nine public datasets, 31 samples and 34 raw labels; the separate strict evaluation panel contains 3,964 aligned cells from eight held-out species. Plant-CellFM combines a 256-dimensional four-layer encoder, an explicit gene-identifier and orthology contract, LoRA adaptation interfaces, hierarchical annotation outputs, ranked marker candidates and a runtime annotation head. In the primary nested leave-species protocol, target labels are excluded from fitting, rule selection and calibration. The result is 39.96% all-cell accuracy, 55.90% source-label coverage, 71.48% accuracy and 0.2817 macro-F1 on the covered-label subset. A separate global context-sensitivity analysis, reported outside the primary protocol, reaches 42.36% all-cell accuracy with the same frozen panel and denominator; its rule-selection boundary remains explicit. Labelled target-species adaptation gives a reproducible dose response from 59.21% to 75.89% mean query all-cell accuracy as support increases from 8 to 64 cells per species across ten disjoint support-query draws. We further provide a label-free external root execution audit, a marker-candidate resource and two author-labelled adaptation cases. In GSE270140/GSM8335426, a LoRA-mode context adapter achieves 83.97% fine accuracy and 84.47% macro-F1 on 2,352 locked test cells, while a pre-registered three-state vascular mapping increases semantic accuracy from 2.02% for the frozen base checkpoint to 90.93% after adaptation. In a barcode-non-overlap allopolyploid wheat-root case (GSE270342), author orthogroups retain 76.33% of source UMI counts and a fixed-split LoRA adapter reaches 62.25% accuracy and 0.6660 macro-F1 across 1,433 locked author-labelled cells. Both adapter results are explicitly same-study supervised adaptation, not zero-shot or independent validation. Plant-CellFM therefore provides a reproducible route for separating strict transfer, target-context adaptation and deployment annotation in plant atlas analysis.</w:t>
       </w:r>
     </w:p>
     <w:p>
@@ -144,7 +144,7 @@
           <w:sz w:val="20"/>
           <w:szCs w:val="20"/>
         </w:rPr>
-        <w:t xml:space="preserve">Here we establish a submission-scale evidence package with a frozen corpus profile, an 8-species nested strict-transfer benchmark, a label-integrity companion analysis, repeat-sampled target-species adaptation, matched internal checkpoint comparisons, a label-free external root execution case, a literature-anchored root candidate resource and a fully audited secondary-root context adapter. Each quantitative result is paired with source data, a declared denominator and a record of what information entered fitting or selection.</w:t>
+        <w:t xml:space="preserve">Here we establish a submission-scale evidence package with a frozen corpus profile, an 8-species nested strict-transfer benchmark, a label-integrity companion analysis, repeat-sampled target-species adaptation, matched internal checkpoint comparisons, a label-free external root execution case, a literature-anchored root candidate resource, a secondary-root context adapter and a provenance-controlled allopolyploid wheat adaptation case. Each quantitative result is paired with source data, a declared denominator and a record of what information entered fitting or selection.</w:t>
       </w:r>
     </w:p>
     <w:p>
@@ -493,23 +493,6 @@
     </w:p>
     <w:p>
       <w:pPr>
-        <w:pStyle w:val="Heading1"/>
-        <w:spacing w:after="110" w:before="270"/>
-      </w:pPr>
-      <w:r>
-        <w:rPr>
-          <w:rFonts w:ascii="Arial" w:cs="Arial" w:eastAsia="Arial" w:hAnsi="Arial"/>
-          <w:b/>
-          <w:bCs/>
-          <w:color w:val="18242E"/>
-          <w:sz w:val="28"/>
-          <w:szCs w:val="28"/>
-        </w:rPr>
-        <w:t xml:space="preserve">Methods</w:t>
-      </w:r>
-    </w:p>
-    <w:p>
-      <w:pPr>
         <w:pStyle w:val="Heading2"/>
         <w:spacing w:after="110" w:before="205"/>
       </w:pPr>
@@ -522,22 +505,69 @@
           <w:sz w:val="23"/>
           <w:szCs w:val="23"/>
         </w:rPr>
-        <w:t xml:space="preserve">Data contracts, corpus profile and label handling</w:t>
-      </w:r>
-    </w:p>
-    <w:p>
-      <w:pPr>
-        <w:spacing w:after="125" w:line="278"/>
-        <w:jc w:val="both"/>
-      </w:pPr>
-      <w:r>
-        <w:rPr>
-          <w:rFonts w:ascii="Arial" w:cs="Arial" w:eastAsia="Arial" w:hAnsi="Arial"/>
-          <w:color w:val="18242E"/>
-          <w:sz w:val="20"/>
-          <w:szCs w:val="20"/>
-        </w:rPr>
-        <w:t xml:space="preserve">The corpus profile is generated directly from the frozen H5AD structure and records cells, genes, species, datasets, samples, tissues and raw labels. Strict evaluation records are frozen separately. Exact gene identifiers are aligned to the checkpoint vocabulary; where direct identifiers are insufficient, orthology mappings are supplied as explicit input artifacts. The v18 identity companion rule is fixed before scoring and treats unknown, unknow and unannotated labels as audit-only records.</w:t>
+        <w:t xml:space="preserve">A provenance-controlled wheat adapter resolves a difficult allopolyploid root atlas</w:t>
+      </w:r>
+    </w:p>
+    <w:p>
+      <w:pPr>
+        <w:spacing w:after="125" w:line="278"/>
+        <w:jc w:val="both"/>
+      </w:pPr>
+      <w:r>
+        <w:rPr>
+          <w:rFonts w:ascii="Arial" w:cs="Arial" w:eastAsia="Arial" w:hAnsi="Arial"/>
+          <w:color w:val="18242E"/>
+          <w:sz w:val="20"/>
+          <w:szCs w:val="20"/>
+        </w:rPr>
+        <w:t xml:space="preserve">We next challenged the adaptation interface with the author-labelled wheat-root atlas GSE270342, a crop case with an allopolyploid genome and non-identical gene identifiers. The author object contains 7,388 cells. An earlier exploratory strict-transfer record contained 256 rows from its CS1 replicate; exact barcode matching identified 224 cells shared with the author object. We excluded all 224 shared barcodes before frozen inference, adapter fitting or test scoring, retaining 7,164 cells. This gate removes direct reuse of the recorded exploratory cells, while the case remains explicitly a same-study re-audit rather than an independent external benchmark (Fig. 5a).</w:t>
+      </w:r>
+    </w:p>
+    <w:p>
+      <w:pPr>
+        <w:spacing w:after="125" w:line="278"/>
+        <w:jc w:val="both"/>
+      </w:pPr>
+      <w:r>
+        <w:rPr>
+          <w:rFonts w:ascii="Arial" w:cs="Arial" w:eastAsia="Arial" w:hAnsi="Arial"/>
+          <w:color w:val="18242E"/>
+          <w:sz w:val="20"/>
+          <w:szCs w:val="20"/>
+        </w:rPr>
+        <w:t xml:space="preserve">Direct Ensembl-style identifiers did not provide an adequate common input space. We therefore used the author-published custom PLAZA orthogroup table as an explicit many-to-many transfer contract. Of 78,115 source features, 41,987 (53.75%) resolve to the frozen checkpoint vocabulary; these features retain 76.33% of source UMI counts. Frozen prediction uses a deterministic first-target projection, and a count-conserving mean-projection sensitivity is reported alongside it rather than selected post hoc. On the locked cells carrying one of eight predeclared direct root identities, the frozen first-target diagnostic reaches 25.93% accuracy and 0.1546 macro-F1 (Fig. 5b,c).</w:t>
+      </w:r>
+    </w:p>
+    <w:p>
+      <w:pPr>
+        <w:spacing w:after="125" w:line="278"/>
+        <w:jc w:val="both"/>
+      </w:pPr>
+      <w:r>
+        <w:rPr>
+          <w:rFonts w:ascii="Arial" w:cs="Arial" w:eastAsia="Arial" w:hAnsi="Arial"/>
+          <w:color w:val="18242E"/>
+          <w:sz w:val="20"/>
+          <w:szCs w:val="20"/>
+        </w:rPr>
+        <w:t xml:space="preserve">We then initialized a LoRA-mode wheat adapter from the frozen root checkpoint and applied a fixed seed cell-level split of 5,014 training cells, 717 validation cells and 1,433 locked test cells. Epoch 8 was selected using validation macro-F1 only. The full 13-class author-label test yields 62.25% accuracy and 0.6660 macro-F1. On the same 964 direct-root test cells used for the frozen diagnostic, accuracy rises to 56.22% and macro-F1 to 0.6847, a 30.29 percentage-point increase (Fig. 5c-f). The released adapter is checksum-linked to the audited training checkpoint. Supplementary Table S20 binds the barcode-exclusion gate, mapping coverage, fixed split, locked-test outcomes and release SHA256 into one reviewable record. This result demonstrates a reproducible route for species-context adaptation under a declared orthology contract; it is not a zero-shot result, an independent validation or a third-party ranking.</w:t>
+      </w:r>
+    </w:p>
+    <w:p>
+      <w:pPr>
+        <w:pStyle w:val="Heading1"/>
+        <w:spacing w:after="110" w:before="270"/>
+      </w:pPr>
+      <w:r>
+        <w:rPr>
+          <w:rFonts w:ascii="Arial" w:cs="Arial" w:eastAsia="Arial" w:hAnsi="Arial"/>
+          <w:b/>
+          <w:bCs/>
+          <w:color w:val="18242E"/>
+          <w:sz w:val="28"/>
+          <w:szCs w:val="28"/>
+        </w:rPr>
+        <w:t xml:space="preserve">Methods</w:t>
       </w:r>
     </w:p>
     <w:p>
@@ -554,22 +584,22 @@
           <w:sz w:val="23"/>
           <w:szCs w:val="23"/>
         </w:rPr>
-        <w:t xml:space="preserve">Strict transfer and adaptation protocols</w:t>
-      </w:r>
-    </w:p>
-    <w:p>
-      <w:pPr>
-        <w:spacing w:after="125" w:line="278"/>
-        <w:jc w:val="both"/>
-      </w:pPr>
-      <w:r>
-        <w:rPr>
-          <w:rFonts w:ascii="Arial" w:cs="Arial" w:eastAsia="Arial" w:hAnsi="Arial"/>
-          <w:color w:val="18242E"/>
-          <w:sz w:val="20"/>
-          <w:szCs w:val="20"/>
-        </w:rPr>
-        <w:t xml:space="preserve">The v17 protocol uses nested source-species selection. Each outer held-out species is evaluated once, after candidate rules are ranked only using source-species inner folds. All-cell accuracy uses every held-out cell as the denominator. Source-label coverage, known-label accuracy and known-label macro-F1 are calculated and reported separately. The context-aware species-transfer calibration (phylo_organ_gate_v1) is a separate global sensitivity analysis over the frozen panel: it records the same denominator and uses organ and phylogenetic support, but its configuration is selected with aggregated outer-fold information and is therefore not promoted to a nested primary result. Few-shot adaptation samples labelled support cells by species, keeps support and query cells non-overlapping, and aggregates ten independent draws per support budget.</w:t>
+        <w:t xml:space="preserve">Data contracts, corpus profile and label handling</w:t>
+      </w:r>
+    </w:p>
+    <w:p>
+      <w:pPr>
+        <w:spacing w:after="125" w:line="278"/>
+        <w:jc w:val="both"/>
+      </w:pPr>
+      <w:r>
+        <w:rPr>
+          <w:rFonts w:ascii="Arial" w:cs="Arial" w:eastAsia="Arial" w:hAnsi="Arial"/>
+          <w:color w:val="18242E"/>
+          <w:sz w:val="20"/>
+          <w:szCs w:val="20"/>
+        </w:rPr>
+        <w:t xml:space="preserve">The corpus profile is generated directly from the frozen H5AD structure and records cells, genes, species, datasets, samples, tissues and raw labels. Strict evaluation records are frozen separately. Exact gene identifiers are aligned to the checkpoint vocabulary; where direct identifiers are insufficient, orthology mappings are supplied as explicit input artifacts. The v18 identity companion rule is fixed before scoring and treats unknown, unknow and unannotated labels as audit-only records.</w:t>
       </w:r>
     </w:p>
     <w:p>
@@ -586,22 +616,22 @@
           <w:sz w:val="23"/>
           <w:szCs w:val="23"/>
         </w:rPr>
-        <w:t xml:space="preserve">Secondary-root adapter</w:t>
-      </w:r>
-    </w:p>
-    <w:p>
-      <w:pPr>
-        <w:spacing w:after="125" w:line="278"/>
-        <w:jc w:val="both"/>
-      </w:pPr>
-      <w:r>
-        <w:rPr>
-          <w:rFonts w:ascii="Arial" w:cs="Arial" w:eastAsia="Arial" w:hAnsi="Arial"/>
-          <w:color w:val="18242E"/>
-          <w:sz w:val="20"/>
-          <w:szCs w:val="20"/>
-        </w:rPr>
-        <w:t xml:space="preserve">The GSE270140 adapter uses configs/gse270140_secondary_root_lora_adapter_4070.yaml: a 256-dimensional, four-layer encoder initialized from SnowLotus_CellFM_SRP169576_annotation_1024_best.pt, LoRA rank 8, class-balanced supervised loss, a maximum of ten epochs and a fixed group-random split by unique cell ID. The run was executed with CUDA on an NVIDIA GeForce RTX 4070 Laptop GPU. The released adapter checkpoint is byte-checked against the checkpoint used for the audit. Configuration, source acquisition, archive inventory, label map, test predictions, per-class scores and semantic recovery tables are versioned in the release tree.</w:t>
+        <w:t xml:space="preserve">Strict transfer and adaptation protocols</w:t>
+      </w:r>
+    </w:p>
+    <w:p>
+      <w:pPr>
+        <w:spacing w:after="125" w:line="278"/>
+        <w:jc w:val="both"/>
+      </w:pPr>
+      <w:r>
+        <w:rPr>
+          <w:rFonts w:ascii="Arial" w:cs="Arial" w:eastAsia="Arial" w:hAnsi="Arial"/>
+          <w:color w:val="18242E"/>
+          <w:sz w:val="20"/>
+          <w:szCs w:val="20"/>
+        </w:rPr>
+        <w:t xml:space="preserve">The v17 protocol uses nested source-species selection. Each outer held-out species is evaluated once, after candidate rules are ranked only using source-species inner folds. All-cell accuracy uses every held-out cell as the denominator. Source-label coverage, known-label accuracy and known-label macro-F1 are calculated and reported separately. The context-aware species-transfer calibration (phylo_organ_gate_v1) is a separate global sensitivity analysis over the frozen panel: it records the same denominator and uses organ and phylogenetic support, but its configuration is selected with aggregated outer-fold information and is therefore not promoted to a nested primary result. Few-shot adaptation samples labelled support cells by species, keeps support and query cells non-overlapping, and aggregates ten independent draws per support budget.</w:t>
       </w:r>
     </w:p>
     <w:p>
@@ -618,6 +648,53 @@
           <w:sz w:val="23"/>
           <w:szCs w:val="23"/>
         </w:rPr>
+        <w:t xml:space="preserve">Supervised secondary-root and wheat-root adapters</w:t>
+      </w:r>
+    </w:p>
+    <w:p>
+      <w:pPr>
+        <w:spacing w:after="125" w:line="278"/>
+        <w:jc w:val="both"/>
+      </w:pPr>
+      <w:r>
+        <w:rPr>
+          <w:rFonts w:ascii="Arial" w:cs="Arial" w:eastAsia="Arial" w:hAnsi="Arial"/>
+          <w:color w:val="18242E"/>
+          <w:sz w:val="20"/>
+          <w:szCs w:val="20"/>
+        </w:rPr>
+        <w:t xml:space="preserve">The GSE270140 adapter uses configs/gse270140_secondary_root_lora_adapter_4070.yaml: a 256-dimensional, four-layer encoder initialized from SnowLotus_CellFM_SRP169576_annotation_1024_best.pt, LoRA rank 8, class-balanced supervised loss, a maximum of ten epochs and a fixed group-random split by unique cell ID. The run was executed with CUDA on an NVIDIA GeForce RTX 4070 Laptop GPU. The released adapter checkpoint is byte-checked against the checkpoint used for the audit. Configuration, source acquisition, archive inventory, label map, test predictions, per-class scores and semantic recovery tables are versioned in the release tree.</w:t>
+      </w:r>
+    </w:p>
+    <w:p>
+      <w:pPr>
+        <w:spacing w:after="125" w:line="278"/>
+        <w:jc w:val="both"/>
+      </w:pPr>
+      <w:r>
+        <w:rPr>
+          <w:rFonts w:ascii="Arial" w:cs="Arial" w:eastAsia="Arial" w:hAnsi="Arial"/>
+          <w:color w:val="18242E"/>
+          <w:sz w:val="20"/>
+          <w:szCs w:val="20"/>
+        </w:rPr>
+        <w:t xml:space="preserve">The GSE270342 wheat adapter uses configs/gse270342_wheat_root_lora_adapter_4070.yaml. The author Seurat object is exported as a cells-by-genes count matrix while preserving cell identifiers and author annotations. Exact CS1 barcode overlap with the historical exploratory strict-transfer record is removed before data preparation. The author orthogroups.csv relation table is retained as the transfer artifact; it is many-to-many, and the deterministic first aggregation used for frozen diagnosis is exposed separately from the count-conserving mean sensitivity. LoRA training uses the same 256-dimensional four-layer root checkpoint, rank 8, class-balanced supervised loss, ten epochs and a fixed group-random 5,014 / 717 / 1,433 cell split. The promotion script copies the selected training checkpoint into the versioned models/ registry only after byte-level equality is established. The audit then checks the release checksum, fixed test cell identifiers, overlap exclusion, full 13-class test and matched eight-state direct-root comparison.</w:t>
+      </w:r>
+    </w:p>
+    <w:p>
+      <w:pPr>
+        <w:pStyle w:val="Heading2"/>
+        <w:spacing w:after="110" w:before="205"/>
+      </w:pPr>
+      <w:r>
+        <w:rPr>
+          <w:rFonts w:ascii="Arial" w:cs="Arial" w:eastAsia="Arial" w:hAnsi="Arial"/>
+          <w:b/>
+          <w:bCs/>
+          <w:color w:val="007C83"/>
+          <w:sz w:val="23"/>
+          <w:szCs w:val="23"/>
+        </w:rPr>
         <w:t xml:space="preserve">Statistics, figures and release audit</w:t>
       </w:r>
     </w:p>
@@ -633,7 +710,7 @@
           <w:sz w:val="20"/>
           <w:szCs w:val="20"/>
         </w:rPr>
-        <w:t xml:space="preserve">The strict-transfer and secondary-root figures use fixed-seed nonparametric bootstrap resampling only to visualize uncertainty conditional on their frozen test populations. Every quantitative visual panel has a TSV source-data file. All main and Extended Data figures are exported as editable SVG and PDF, PNG preview and 600-dpi TIFF. The v5 audit checks file presence, editable SVG text, source-table presence, raster resolution, frozen strict metrics, secondary-root checkpoint checksum and supplementary-table paths. It reports technical readiness but does not substitute a subjective readiness score for editorial or peer review.</w:t>
+        <w:t xml:space="preserve">The strict-transfer, secondary-root and matched wheat-root figures use fixed-seed nonparametric bootstrap resampling only to visualize uncertainty conditional on their frozen test populations. Every quantitative visual panel has a TSV source-data file. All main and Extended Data figures are exported as editable SVG and PDF, PNG preview and 600-dpi TIFF. The v5 audit checks file presence, editable SVG text, source-table presence, raster resolution, frozen strict metrics, both released adapter checksums, the wheat overlap exclusion and fixed split, and the Table S20 release record. It reports technical readiness but does not substitute a subjective readiness score for editorial or peer review.</w:t>
       </w:r>
     </w:p>
     <w:p>
@@ -665,7 +742,7 @@
           <w:sz w:val="20"/>
           <w:szCs w:val="20"/>
         </w:rPr>
-        <w:t xml:space="preserve">The repository, source code, v5 manuscript, model card, evidence ledger, figures, source data and reproducibility records are available at https://github.com/ahvsjags/SnowLotus-CellFM on branch agent/remote-pipeline-20260728. The v5 GSE270140 adapter is tracked through Git LFS and has SHA256 1a306c4a5e21630a75a5a63d2867e86712b2da78eea3805eb5dc00b957134fd7. Reproduce the context-adaptation evidence with:</w:t>
+        <w:t xml:space="preserve">The repository, source code, v5 manuscript, model card, evidence ledger, figures, source data and reproducibility records are available at https://github.com/ahvsjags/SnowLotus-CellFM on branch agent/remote-pipeline-20260728. The v5 GSE270140 and GSE270342 adapters are tracked through Git LFS and have SHA256 1a306c4a5e21630a75a5a63d2867e86712b2da78eea3805eb5dc00b957134fd7 and 597b7e425b0355ddfa81e4f5c9c63e85987d6b72fe49a841736b200ea6c2c22e, respectively. Reproduce the context-adaptation evidence with:</w:t>
       </w:r>
     </w:p>
     <w:p>
@@ -692,6 +769,14 @@
 python -m snowcell.cli train --config configs/gse270140_secondary_root_lora_adapter_4070.yaml --device cuda
 python scripts/audit_gse270140_secondary_root_adapter.py
 python scripts/render_v5_secondary_root_adapter_figure.py
+python scripts/download_gse270342_author_reference.py
+python scripts/fetch_gse270342_wheat_arabidopsis_orthologs.py
+python scripts/prepare_gse270342_wheat_root_case.py
+python -m snowcell.cli train --config configs/gse270342_wheat_root_lora_adapter_4070.yaml --device cuda
+python scripts/evaluate_checkpoint_detailed.py --config configs/gse270342_wheat_root_lora_adapter_4070.yaml --checkpoint outputs/gse270342_wheat_root_lora_adapter_4070/best.pt --split test --output-dir outputs/gse270342_wheat_root_lora_adapter_4070/detailed_test --device cuda --batch-size 16
+python scripts/promote_gse270342_wheat_adapter.py
+python scripts/audit_gse270342_wheat_lora_adapter.py
+python scripts/render_v5_wheat_root_adapter_figure.py
 python scripts/audit_v5_submission_figure_suite.py</w:t>
       </w:r>
     </w:p>
@@ -784,6 +869,21 @@
           <w:sz w:val="20"/>
           <w:szCs w:val="20"/>
         </w:rPr>
+        <w:t xml:space="preserve">Figure 5 | Provenance-controlled allopolyploid wheat-root adaptation. The author-labelled GSE270342 wheat object is shown after exclusion of 224 exact CS1 barcodes overlapping a historical exploratory strict-transfer record. The frozen first-target diagnostic, full 13-class locked-test confusion matrix, per-class F1 and validation-only model selection are presented separately. The adapter is trained and evaluated within the same public author-labelled study on a fixed cell-level split; it is neither a zero-shot result nor independent external validation.</w:t>
+      </w:r>
+    </w:p>
+    <w:p>
+      <w:pPr>
+        <w:spacing w:after="125" w:line="278"/>
+        <w:jc w:val="both"/>
+      </w:pPr>
+      <w:r>
+        <w:rPr>
+          <w:rFonts w:ascii="Arial" w:cs="Arial" w:eastAsia="Arial" w:hAnsi="Arial"/>
+          <w:color w:val="18242E"/>
+          <w:sz w:val="20"/>
+          <w:szCs w:val="20"/>
+        </w:rPr>
         <w:t xml:space="preserve">Extended Data Figure 6 | Author-labelled secondary-root LoRA-mode adaptation. The frozen root checkpoint is adapted on the GSE270140/GSM8335426 train partition and selected on validation cells. The matched semantic recovery, 14-class held-out confusion matrix, per-class F1, validation history and locked-test metrics are shown. The protocol is supervised one-sample adaptation, not zero-shot or independent validation.</w:t>
       </w:r>
     </w:p>
@@ -978,6 +1078,38 @@
           <w:szCs w:val="20"/>
         </w:rPr>
         <w:t xml:space="preserve">Lyu, M. et al. The dynamic and diverse nature of parenchyma cells in the Arabidopsis root during secondary growth. Nature Plants (2025). https://doi.org/10.1038/s41477-025-01938-6</w:t>
+      </w:r>
+    </w:p>
+    <w:p>
+      <w:pPr>
+        <w:spacing w:after="125" w:line="278"/>
+        <w:ind w:left="260" w:hanging="260"/>
+        <w:jc w:val="both"/>
+      </w:pPr>
+      <w:r>
+        <w:rPr>
+          <w:rFonts w:ascii="Arial" w:cs="Arial" w:eastAsia="Arial" w:hAnsi="Arial"/>
+          <w:color w:val="18242E"/>
+          <w:sz w:val="20"/>
+          <w:szCs w:val="20"/>
+        </w:rPr>
+        <w:t xml:space="preserve">Ke, Y. et al. A single-cell and spatial wheat root atlas with cross-species annotations delineates conserved tissue-specific marker genes and regulators. Cell Reports 44, 115240 (2025). https://doi.org/10.1016/j.celrep.2025.115240</w:t>
+      </w:r>
+    </w:p>
+    <w:p>
+      <w:pPr>
+        <w:spacing w:after="125" w:line="278"/>
+        <w:ind w:left="260" w:hanging="260"/>
+        <w:jc w:val="both"/>
+      </w:pPr>
+      <w:r>
+        <w:rPr>
+          <w:rFonts w:ascii="Arial" w:cs="Arial" w:eastAsia="Arial" w:hAnsi="Arial"/>
+          <w:color w:val="18242E"/>
+          <w:sz w:val="20"/>
+          <w:szCs w:val="20"/>
+        </w:rPr>
+        <w:t xml:space="preserve">NCBI Gene Expression Omnibus. Triticum aestivum GSE270342: a soil-grown wheat root atlas with validated cross-species cluster annotations. https://www.ncbi.nlm.nih.gov/geo/query/acc.cgi?acc=GSE270342</w:t>
       </w:r>
     </w:p>
     <w:p>
@@ -1257,7 +1389,7 @@
       <w:r>
         <w:drawing>
           <wp:inline distT="0" distB="0" distL="0" distR="0">
-            <wp:extent cx="6000750" cy="3810000"/>
+            <wp:extent cx="6000750" cy="5905500"/>
             <wp:effectExtent t="0" r="0" b="0" l="0"/>
             <wp:docPr id="1" name="" descr="" title=""/>
             <wp:cNvGraphicFramePr>
@@ -1282,7 +1414,7 @@
                   <pic:spPr bwMode="auto">
                     <a:xfrm>
                       <a:off x="0" y="0"/>
-                      <a:ext cx="6000750" cy="3810000"/>
+                      <a:ext cx="6000750" cy="5905500"/>
                     </a:xfrm>
                     <a:prstGeom prst="rect">
                       <a:avLst/>
@@ -1309,7 +1441,7 @@
           <w:sz w:val="17"/>
           <w:szCs w:val="17"/>
         </w:rPr>
-        <w:t xml:space="preserve">Extended Data Figure 1 | Explicit-identity and audit-only label denominator analysis.</w:t>
+        <w:t xml:space="preserve">Figure 5 | Provenance-controlled allopolyploid wheat-root adaptation. Exact barcode overlap is excluded before inference and tuning; the LoRA result is same-study supervised adaptation, not zero-shot or independent validation.</w:t>
       </w:r>
     </w:p>
     <w:p>
@@ -1372,7 +1504,7 @@
           <w:sz w:val="17"/>
           <w:szCs w:val="17"/>
         </w:rPr>
-        <w:t xml:space="preserve">Extended Data Figure 2 | Inner-fold rule-selection audit for the strict protocol.</w:t>
+        <w:t xml:space="preserve">Extended Data Figure 1 | Explicit-identity and audit-only label denominator analysis.</w:t>
       </w:r>
     </w:p>
     <w:p>
@@ -1435,7 +1567,7 @@
           <w:sz w:val="17"/>
           <w:szCs w:val="17"/>
         </w:rPr>
-        <w:t xml:space="preserve">Extended Data Figure 3 | Matched frozen v3-to-v9 checkpoint comparison.</w:t>
+        <w:t xml:space="preserve">Extended Data Figure 2 | Inner-fold rule-selection audit for the strict protocol.</w:t>
       </w:r>
     </w:p>
     <w:p>
@@ -1446,7 +1578,7 @@
       <w:r>
         <w:drawing>
           <wp:inline distT="0" distB="0" distL="0" distR="0">
-            <wp:extent cx="6000750" cy="4000500"/>
+            <wp:extent cx="6000750" cy="3810000"/>
             <wp:effectExtent t="0" r="0" b="0" l="0"/>
             <wp:docPr id="1" name="" descr="" title=""/>
             <wp:cNvGraphicFramePr>
@@ -1471,7 +1603,7 @@
                   <pic:spPr bwMode="auto">
                     <a:xfrm>
                       <a:off x="0" y="0"/>
-                      <a:ext cx="6000750" cy="4000500"/>
+                      <a:ext cx="6000750" cy="3810000"/>
                     </a:xfrm>
                     <a:prstGeom prst="rect">
                       <a:avLst/>
@@ -1498,7 +1630,7 @@
           <w:sz w:val="17"/>
           <w:szCs w:val="17"/>
         </w:rPr>
-        <w:t xml:space="preserve">Extended Data Figure 4 | Literature-fixed root-marker concordance for the candidate resource.</w:t>
+        <w:t xml:space="preserve">Extended Data Figure 3 | Matched frozen v3-to-v9 checkpoint comparison.</w:t>
       </w:r>
     </w:p>
     <w:p>
@@ -1509,7 +1641,7 @@
       <w:r>
         <w:drawing>
           <wp:inline distT="0" distB="0" distL="0" distR="0">
-            <wp:extent cx="6000750" cy="5334000"/>
+            <wp:extent cx="6000750" cy="4000500"/>
             <wp:effectExtent t="0" r="0" b="0" l="0"/>
             <wp:docPr id="1" name="" descr="" title=""/>
             <wp:cNvGraphicFramePr>
@@ -1534,6 +1666,69 @@
                   <pic:spPr bwMode="auto">
                     <a:xfrm>
                       <a:off x="0" y="0"/>
+                      <a:ext cx="6000750" cy="4000500"/>
+                    </a:xfrm>
+                    <a:prstGeom prst="rect">
+                      <a:avLst/>
+                    </a:prstGeom>
+                  </pic:spPr>
+                </pic:pic>
+              </a:graphicData>
+            </a:graphic>
+          </wp:inline>
+        </w:drawing>
+      </w:r>
+    </w:p>
+    <w:p>
+      <w:pPr>
+        <w:spacing w:after="210"/>
+        <w:jc w:val="center"/>
+      </w:pPr>
+      <w:r>
+        <w:rPr>
+          <w:rFonts w:ascii="Arial" w:cs="Arial" w:eastAsia="Arial" w:hAnsi="Arial"/>
+          <w:i/>
+          <w:iCs/>
+          <w:color w:val="60717D"/>
+          <w:sz w:val="17"/>
+          <w:szCs w:val="17"/>
+        </w:rPr>
+        <w:t xml:space="preserve">Extended Data Figure 4 | Literature-fixed root-marker concordance for the candidate resource.</w:t>
+      </w:r>
+    </w:p>
+    <w:p>
+      <w:pPr>
+        <w:spacing w:after="70" w:before="160"/>
+        <w:jc w:val="center"/>
+      </w:pPr>
+      <w:r>
+        <w:drawing>
+          <wp:inline distT="0" distB="0" distL="0" distR="0">
+            <wp:extent cx="6000750" cy="5334000"/>
+            <wp:effectExtent t="0" r="0" b="0" l="0"/>
+            <wp:docPr id="1" name="" descr="" title=""/>
+            <wp:cNvGraphicFramePr>
+              <a:graphicFrameLocks xmlns:a="http://schemas.openxmlformats.org/drawingml/2006/main" noChangeAspect="1"/>
+            </wp:cNvGraphicFramePr>
+            <a:graphic xmlns:a="http://schemas.openxmlformats.org/drawingml/2006/main">
+              <a:graphicData uri="http://schemas.openxmlformats.org/drawingml/2006/picture">
+                <pic:pic xmlns:pic="http://schemas.openxmlformats.org/drawingml/2006/picture">
+                  <pic:nvPicPr>
+                    <pic:cNvPr id="0" name="" descr=""/>
+                    <pic:cNvPicPr>
+                      <a:picLocks noChangeAspect="1" noChangeArrowheads="1"/>
+                    </pic:cNvPicPr>
+                  </pic:nvPicPr>
+                  <pic:blipFill>
+                    <a:blip r:embed="rId17" cstate="none"/>
+                    <a:srcRect/>
+                    <a:stretch>
+                      <a:fillRect/>
+                    </a:stretch>
+                  </pic:blipFill>
+                  <pic:spPr bwMode="auto">
+                    <a:xfrm>
+                      <a:off x="0" y="0"/>
                       <a:ext cx="6000750" cy="5334000"/>
                     </a:xfrm>
                     <a:prstGeom prst="rect">
@@ -1588,7 +1783,7 @@
                     </pic:cNvPicPr>
                   </pic:nvPicPr>
                   <pic:blipFill>
-                    <a:blip r:embed="rId17" cstate="none"/>
+                    <a:blip r:embed="rId18" cstate="none"/>
                     <a:srcRect/>
                     <a:stretch>
                       <a:fillRect/>

</xml_diff>